<commit_message>
Starling Desktop manual in the Editorial template: serif text, sans headings with a rule, preface on its own page
</commit_message>
<xml_diff>
--- a/docs/choosing-starling-at-login/choosing-starling-at-login.docx
+++ b/docs/choosing-starling-at-login/choosing-starling-at-login.docx
@@ -5,13 +5,12 @@
     <w:p>
       <w:pPr>
         <w:pStyle w:val="Heading1"/>
+        <w:keepNext/>
+        <w:keepLines/>
         <w:pBdr>
-          <w:top w:val="nil"/>
-          <w:left w:val="nil"/>
-          <w:bottom w:val="nil"/>
-          <w:right w:val="nil"/>
+          <w:bottom w:val="single" w:sz="12" w:space="6" w:color="C8102E"/>
         </w:pBdr>
-        <w:spacing w:before="0" w:after="160" w:line="259" w:lineRule="auto"/>
+        <w:spacing w:before="560" w:after="200" w:line="281" w:lineRule="auto"/>
       </w:pPr>
       <w:r>
         <w:t xml:space="preserve">Choosing Starling at login</w:t>
@@ -426,15 +425,15 @@
   <w:docDefaults>
     <w:rPrDefault>
       <w:rPr>
-        <w:rFonts w:ascii="Arial" w:hAnsi="Arial" w:cs="Arial" w:eastAsia="Arial"/>
-        <w:sz w:val="22"/>
-        <w:szCs w:val="22"/>
+        <w:rFonts w:ascii="Caladea" w:hAnsi="Caladea" w:cs="Caladea" w:eastAsia="Caladea"/>
+        <w:sz w:val="23"/>
+        <w:szCs w:val="23"/>
         <w:lang w:val="en-US"/>
       </w:rPr>
     </w:rPrDefault>
     <w:pPrDefault>
       <w:pPr>
-        <w:spacing w:after="160" w:line="276" w:lineRule="auto"/>
+        <w:spacing w:after="161" w:line="281" w:lineRule="auto"/>
       </w:pPr>
     </w:pPrDefault>
   </w:docDefaults>
@@ -448,15 +447,18 @@
     <w:next w:val="Normal"/>
     <w:qFormat/>
     <w:pPr>
-      <w:spacing w:before="2400" w:after="120" w:line="276" w:lineRule="auto"/>
-    </w:pPr>
-    <w:rPr>
+      <w:pBdr>
+        <w:bottom w:val="single" w:sz="24" w:space="10" w:color="C8102E"/>
+      </w:pBdr>
+      <w:spacing w:before="2600" w:after="160" w:line="281" w:lineRule="auto"/>
+    </w:pPr>
+    <w:rPr>
+      <w:rFonts w:ascii="Libre Franklin" w:hAnsi="Libre Franklin" w:cs="Libre Franklin"/>
       <w:b/>
       <w:bCs/>
-      <w:color w:val="1F2A44"/>
-      <w:spacing w:val="-10"/>
-      <w:sz w:val="72"/>
-      <w:szCs w:val="72"/>
+      <w:color w:val="0F3D4C"/>
+      <w:sz w:val="80"/>
+      <w:szCs w:val="80"/>
     </w:rPr>
   </w:style>
   <w:style w:type="paragraph" w:styleId="Subtitle">
@@ -465,12 +467,15 @@
     <w:next w:val="Normal"/>
     <w:qFormat/>
     <w:pPr>
-      <w:spacing w:after="480" w:line="276" w:lineRule="auto"/>
-    </w:pPr>
-    <w:rPr>
-      <w:color w:val="6B7280"/>
-      <w:sz w:val="32"/>
-      <w:szCs w:val="32"/>
+      <w:spacing w:before="200" w:after="600" w:line="281" w:lineRule="auto"/>
+    </w:pPr>
+    <w:rPr>
+      <w:rFonts w:ascii="Caladea" w:hAnsi="Caladea" w:cs="Caladea"/>
+      <w:i/>
+      <w:iCs/>
+      <w:color w:val="6B6B6B"/>
+      <w:sz w:val="36"/>
+      <w:szCs w:val="36"/>
     </w:rPr>
   </w:style>
   <w:style w:type="paragraph" w:styleId="Heading1">
@@ -481,17 +486,18 @@
     <w:pPr>
       <w:keepNext/>
       <w:pBdr>
-        <w:bottom w:val="single" w:sz="6" w:space="4" w:color="D0D7E2"/>
+        <w:bottom w:val="single" w:sz="12" w:space="6" w:color="C8102E"/>
       </w:pBdr>
-      <w:spacing w:before="480" w:after="160" w:line="276" w:lineRule="auto"/>
+      <w:spacing w:before="560" w:after="200" w:line="281" w:lineRule="auto"/>
       <w:outlineLvl w:val="0"/>
     </w:pPr>
     <w:rPr>
+      <w:rFonts w:ascii="Libre Franklin" w:hAnsi="Libre Franklin" w:cs="Libre Franklin"/>
       <w:b/>
       <w:bCs/>
-      <w:color w:val="1F2A44"/>
-      <w:sz w:val="40"/>
-      <w:szCs w:val="40"/>
+      <w:color w:val="0F3D4C"/>
+      <w:sz w:val="42"/>
+      <w:szCs w:val="42"/>
     </w:rPr>
   </w:style>
   <w:style w:type="paragraph" w:styleId="Heading2">
@@ -501,13 +507,14 @@
     <w:qFormat/>
     <w:pPr>
       <w:keepNext/>
-      <w:spacing w:before="360" w:after="120" w:line="276" w:lineRule="auto"/>
+      <w:spacing w:before="400" w:after="120" w:line="281" w:lineRule="auto"/>
       <w:outlineLvl w:val="1"/>
     </w:pPr>
     <w:rPr>
+      <w:rFonts w:ascii="Libre Franklin" w:hAnsi="Libre Franklin" w:cs="Libre Franklin"/>
       <w:b/>
       <w:bCs/>
-      <w:color w:val="2F5496"/>
+      <w:color w:val="0F3D4C"/>
       <w:sz w:val="28"/>
       <w:szCs w:val="28"/>
     </w:rPr>
@@ -519,15 +526,16 @@
     <w:qFormat/>
     <w:pPr>
       <w:keepNext/>
-      <w:spacing w:before="240" w:after="80" w:line="276" w:lineRule="auto"/>
+      <w:spacing w:before="280" w:after="80" w:line="281" w:lineRule="auto"/>
       <w:outlineLvl w:val="2"/>
     </w:pPr>
     <w:rPr>
+      <w:rFonts w:ascii="Libre Franklin" w:hAnsi="Libre Franklin" w:cs="Libre Franklin"/>
       <w:b/>
       <w:bCs/>
-      <w:color w:val="1F2328"/>
-      <w:sz w:val="24"/>
-      <w:szCs w:val="24"/>
+      <w:color w:val="222222"/>
+      <w:sz w:val="23"/>
+      <w:szCs w:val="23"/>
     </w:rPr>
   </w:style>
   <w:style w:type="paragraph" w:styleId="Heading4">
@@ -591,15 +599,15 @@
     <w:qFormat/>
     <w:pPr>
       <w:pBdr>
-        <w:left w:val="single" w:sz="18" w:space="12" w:color="auto"/>
+        <w:left w:val="single" w:sz="24" w:space="14" w:color="C8102E"/>
       </w:pBdr>
-      <w:spacing w:before="160" w:after="160" w:line="276" w:lineRule="auto"/>
-      <w:ind w:left="720" w:right="720"/>
+      <w:spacing w:before="160" w:after="200" w:line="281" w:lineRule="auto"/>
+      <w:ind w:left="600" w:right="600"/>
     </w:pPr>
     <w:rPr>
       <w:i/>
       <w:iCs/>
-      <w:color w:val="404040"/>
+      <w:color w:val="444444"/>
     </w:rPr>
   </w:style>
   <w:style w:type="paragraph" w:styleId="Caption">
@@ -608,12 +616,12 @@
     <w:next w:val="Normal"/>
     <w:qFormat/>
     <w:pPr>
-      <w:spacing w:after="200" w:line="276" w:lineRule="auto"/>
+      <w:spacing w:after="220" w:line="281" w:lineRule="auto"/>
     </w:pPr>
     <w:rPr>
       <w:i/>
       <w:iCs/>
-      <w:color w:val="6B7280"/>
+      <w:color w:val="6B6B6B"/>
       <w:sz w:val="18"/>
       <w:szCs w:val="18"/>
     </w:rPr>
@@ -625,11 +633,12 @@
     <w:qFormat/>
     <w:pPr>
       <w:shd w:val="clear" w:color="auto" w:fill="F3F4F6"/>
-      <w:spacing w:after="0" w:line="240" w:lineRule="auto"/>
-      <w:ind w:left="240" w:right="240"/>
-    </w:pPr>
-    <w:rPr>
-      <w:rFonts w:ascii="Courier New" w:hAnsi="Courier New" w:cs="Courier New"/>
+      <w:spacing w:after="0" w:line="252" w:lineRule="auto"/>
+      <w:ind w:left="200" w:right="200"/>
+    </w:pPr>
+    <w:rPr>
+      <w:rFonts w:ascii="Liberation Mono" w:hAnsi="Liberation Mono" w:cs="Liberation Mono"/>
+      <w:color w:val="1F2328"/>
       <w:sz w:val="19"/>
       <w:szCs w:val="19"/>
     </w:rPr>
@@ -642,11 +651,12 @@
       <w:pBdr>
         <w:bottom w:val="single" w:sz="4" w:space="4" w:color="D0D7E2"/>
       </w:pBdr>
-      <w:spacing w:after="0" w:line="276" w:lineRule="auto"/>
+      <w:spacing w:after="0" w:line="281" w:lineRule="auto"/>
       <w:jc w:val="right"/>
     </w:pPr>
     <w:rPr>
-      <w:color w:val="6B7280"/>
+      <w:rFonts w:ascii="Libre Franklin" w:hAnsi="Libre Franklin" w:cs="Libre Franklin"/>
+      <w:color w:val="6B6B6B"/>
       <w:sz w:val="17"/>
       <w:szCs w:val="17"/>
     </w:rPr>
@@ -656,11 +666,12 @@
     <w:basedOn w:val="Normal"/>
     <w:qFormat/>
     <w:pPr>
-      <w:spacing w:after="0" w:line="276" w:lineRule="auto"/>
+      <w:spacing w:after="0" w:line="281" w:lineRule="auto"/>
       <w:jc w:val="center"/>
     </w:pPr>
     <w:rPr>
-      <w:color w:val="6B7280"/>
+      <w:rFonts w:ascii="Libre Franklin" w:hAnsi="Libre Franklin" w:cs="Libre Franklin"/>
+      <w:color w:val="6B6B6B"/>
       <w:sz w:val="17"/>
       <w:szCs w:val="17"/>
     </w:rPr>
@@ -679,7 +690,7 @@
     <w:qFormat/>
     <w:pPr/>
     <w:rPr>
-      <w:color w:val="2F5496"/>
+      <w:color w:val="C8102E"/>
       <w:u w:val="single"/>
     </w:rPr>
   </w:style>

</xml_diff>